<commit_message>
Add direct feedback QR links
</commit_message>
<xml_diff>
--- a/RISE_in_Brief.docx
+++ b/RISE_in_Brief.docx
@@ -52,7 +52,7 @@
     </w:p>
     <w:p>
       <w:pPr>
-        <w:spacing w:after="100" w:before="220" w:line="432" w:lineRule="exact"/>
+        <w:spacing w:after="100" w:before="100" w:line="432" w:lineRule="exact"/>
         <w:jc w:val="center"/>
       </w:pPr>
       <w:r>
@@ -68,7 +68,7 @@
     </w:p>
     <w:p>
       <w:pPr>
-        <w:spacing w:after="160" w:before="0" w:line="360" w:lineRule="exact"/>
+        <w:spacing w:after="80" w:before="0" w:line="360" w:lineRule="exact"/>
         <w:jc w:val="center"/>
       </w:pPr>
       <w:r>
@@ -84,7 +84,7 @@
     </w:p>
     <w:p>
       <w:pPr>
-        <w:spacing w:after="100" w:before="220" w:line="432" w:lineRule="exact"/>
+        <w:spacing w:after="100" w:before="100" w:line="432" w:lineRule="exact"/>
         <w:jc w:val="center"/>
       </w:pPr>
       <w:r>
@@ -100,7 +100,7 @@
     </w:p>
     <w:p>
       <w:pPr>
-        <w:spacing w:after="160" w:before="0" w:line="360" w:lineRule="exact"/>
+        <w:spacing w:after="80" w:before="0" w:line="360" w:lineRule="exact"/>
         <w:jc w:val="center"/>
       </w:pPr>
       <w:r>
@@ -116,7 +116,7 @@
     </w:p>
     <w:p>
       <w:pPr>
-        <w:spacing w:after="100" w:before="220" w:line="432" w:lineRule="exact"/>
+        <w:spacing w:after="100" w:before="100" w:line="432" w:lineRule="exact"/>
         <w:jc w:val="center"/>
       </w:pPr>
       <w:r>
@@ -132,7 +132,7 @@
     </w:p>
     <w:p>
       <w:pPr>
-        <w:spacing w:after="160" w:before="0" w:line="360" w:lineRule="exact"/>
+        <w:spacing w:after="80" w:before="0" w:line="360" w:lineRule="exact"/>
         <w:jc w:val="center"/>
       </w:pPr>
       <w:r>
@@ -148,7 +148,7 @@
     </w:p>
     <w:p>
       <w:pPr>
-        <w:spacing w:after="100" w:before="220" w:line="432" w:lineRule="exact"/>
+        <w:spacing w:after="100" w:before="100" w:line="432" w:lineRule="exact"/>
         <w:jc w:val="center"/>
       </w:pPr>
       <w:r>
@@ -164,7 +164,7 @@
     </w:p>
     <w:p>
       <w:pPr>
-        <w:spacing w:after="160" w:before="0" w:line="360" w:lineRule="exact"/>
+        <w:spacing w:after="80" w:before="0" w:line="360" w:lineRule="exact"/>
         <w:jc w:val="center"/>
       </w:pPr>
       <w:r>
@@ -180,7 +180,7 @@
     </w:p>
     <w:p>
       <w:pPr>
-        <w:spacing w:after="0" w:before="300" w:line="252" w:lineRule="exact"/>
+        <w:spacing w:after="0" w:before="180" w:line="252" w:lineRule="exact"/>
         <w:jc w:val="center"/>
       </w:pPr>
       <w:r>
@@ -196,7 +196,7 @@
     </w:p>
     <w:p>
       <w:pPr>
-        <w:spacing w:after="0" w:before="240" w:line="200" w:lineRule="exact"/>
+        <w:spacing w:after="0" w:before="120" w:line="200" w:lineRule="exact"/>
         <w:jc w:val="center"/>
       </w:pPr>
       <w:r>
@@ -210,6 +210,216 @@
         <w:t>The water lilies honour my late mother, Jean, who rose from hardship at society’s margins to greatness of character before her passing in 2022.</w:t>
       </w:r>
     </w:p>
+    <w:p>
+      <w:pPr>
+        <w:keepNext/>
+        <w:spacing w:before="80" w:after="20"/>
+        <w:jc w:val="center"/>
+      </w:pPr>
+      <w:r>
+        <w:rPr>
+          <w:rFonts w:ascii="Latin Modern Roman" w:hAnsi="Latin Modern Roman"/>
+          <w:b/>
+          <w:i w:val="0"/>
+          <w:color w:val="A87421"/>
+          <w:sz w:val="15"/>
+        </w:rPr>
+        <w:t>GIVE ANONYMOUS FEEDBACK</w:t>
+      </w:r>
+    </w:p>
+    <w:tbl>
+      <w:tblPr>
+        <w:tblW w:type="auto" w:w="0"/>
+        <w:jc w:val="center"/>
+        <w:tblLayout w:type="fixed"/>
+        <w:tblLook w:firstColumn="1" w:firstRow="1" w:lastColumn="0" w:lastRow="0" w:noHBand="0" w:noVBand="1" w:val="04A0"/>
+        <w:tblBorders>
+          <w:top w:val="nil"/>
+          <w:left w:val="nil"/>
+          <w:bottom w:val="nil"/>
+          <w:right w:val="nil"/>
+          <w:insideH w:val="nil"/>
+          <w:insideV w:val="nil"/>
+        </w:tblBorders>
+      </w:tblPr>
+      <w:tblGrid>
+        <w:gridCol w:w="3384"/>
+        <w:gridCol w:w="3384"/>
+      </w:tblGrid>
+      <w:tr>
+        <w:trPr/>
+        <w:tc>
+          <w:tcPr>
+            <w:tcW w:type="dxa" w:w="3096"/>
+            <w:vAlign w:val="center"/>
+            <w:tcMar>
+              <w:top w:w="20" w:type="dxa"/>
+              <w:start w:w="40" w:type="dxa"/>
+              <w:bottom w:w="20" w:type="dxa"/>
+              <w:end w:w="40" w:type="dxa"/>
+            </w:tcMar>
+          </w:tcPr>
+          <w:p>
+            <w:pPr>
+              <w:spacing w:before="0" w:after="0" w:line="240" w:lineRule="auto"/>
+              <w:jc w:val="center"/>
+            </w:pPr>
+            <w:r>
+              <w:rPr>
+                <w:rFonts w:ascii="Latin Modern Roman" w:hAnsi="Latin Modern Roman"/>
+                <w:b/>
+                <w:i w:val="0"/>
+                <w:color w:val="173F31"/>
+                <w:sz w:val="13"/>
+              </w:rPr>
+              <w:t>CPME INTERNAL</w:t>
+            </w:r>
+          </w:p>
+          <w:p>
+            <w:pPr>
+              <w:spacing w:before="0" w:after="0" w:line="240" w:lineRule="auto"/>
+              <w:jc w:val="center"/>
+            </w:pPr>
+            <w:r>
+              <w:drawing>
+                <wp:inline xmlns:a="http://schemas.openxmlformats.org/drawingml/2006/main" xmlns:pic="http://schemas.openxmlformats.org/drawingml/2006/picture">
+                  <wp:extent cx="640080" cy="640080"/>
+                  <wp:docPr id="1" name="Picture 1"/>
+                  <wp:cNvGraphicFramePr>
+                    <a:graphicFrameLocks noChangeAspect="1"/>
+                  </wp:cNvGraphicFramePr>
+                  <a:graphic>
+                    <a:graphicData uri="http://schemas.openxmlformats.org/drawingml/2006/picture">
+                      <pic:pic>
+                        <pic:nvPicPr>
+                          <pic:cNvPr id="0" name="qr-rise-cpme.png"/>
+                          <pic:cNvPicPr/>
+                        </pic:nvPicPr>
+                        <pic:blipFill>
+                          <a:blip r:embed="rId10"/>
+                          <a:stretch>
+                            <a:fillRect/>
+                          </a:stretch>
+                        </pic:blipFill>
+                        <pic:spPr>
+                          <a:xfrm>
+                            <a:off x="0" y="0"/>
+                            <a:ext cx="640080" cy="640080"/>
+                          </a:xfrm>
+                          <a:prstGeom prst="rect"/>
+                        </pic:spPr>
+                      </pic:pic>
+                    </a:graphicData>
+                  </a:graphic>
+                </wp:inline>
+              </w:drawing>
+            </w:r>
+          </w:p>
+          <w:p>
+            <w:pPr>
+              <w:spacing w:before="0" w:after="0" w:line="240" w:lineRule="auto"/>
+              <w:jc w:val="center"/>
+            </w:pPr>
+            <w:hyperlink r:id="rId11">
+              <w:r>
+                <w:rPr>
+                  <w:rFonts w:ascii="Latin Modern Roman" w:hAnsi="Latin Modern Roman"/>
+                  <w:color w:val="173F31"/>
+                  <w:sz w:val="12"/>
+                  <w:u w:val="single"/>
+                </w:rPr>
+                <w:t>forms.gle/jer5s3R3R66ZRJev6</w:t>
+              </w:r>
+            </w:hyperlink>
+          </w:p>
+        </w:tc>
+        <w:tc>
+          <w:tcPr>
+            <w:tcW w:type="dxa" w:w="3096"/>
+            <w:vAlign w:val="center"/>
+            <w:tcMar>
+              <w:top w:w="20" w:type="dxa"/>
+              <w:start w:w="40" w:type="dxa"/>
+              <w:bottom w:w="20" w:type="dxa"/>
+              <w:end w:w="40" w:type="dxa"/>
+            </w:tcMar>
+          </w:tcPr>
+          <w:p>
+            <w:pPr>
+              <w:spacing w:before="0" w:after="0" w:line="240" w:lineRule="auto"/>
+              <w:jc w:val="center"/>
+            </w:pPr>
+            <w:r>
+              <w:rPr>
+                <w:rFonts w:ascii="Latin Modern Roman" w:hAnsi="Latin Modern Roman"/>
+                <w:b/>
+                <w:i w:val="0"/>
+                <w:color w:val="173F31"/>
+                <w:sz w:val="13"/>
+              </w:rPr>
+              <w:t>EXTERNAL READERS</w:t>
+            </w:r>
+          </w:p>
+          <w:p>
+            <w:pPr>
+              <w:spacing w:before="0" w:after="0" w:line="240" w:lineRule="auto"/>
+              <w:jc w:val="center"/>
+            </w:pPr>
+            <w:r>
+              <w:drawing>
+                <wp:inline xmlns:a="http://schemas.openxmlformats.org/drawingml/2006/main" xmlns:pic="http://schemas.openxmlformats.org/drawingml/2006/picture">
+                  <wp:extent cx="640080" cy="640080"/>
+                  <wp:docPr id="2" name="Picture 2"/>
+                  <wp:cNvGraphicFramePr>
+                    <a:graphicFrameLocks noChangeAspect="1"/>
+                  </wp:cNvGraphicFramePr>
+                  <a:graphic>
+                    <a:graphicData uri="http://schemas.openxmlformats.org/drawingml/2006/picture">
+                      <pic:pic>
+                        <pic:nvPicPr>
+                          <pic:cNvPr id="0" name="qr-rise-readers.png"/>
+                          <pic:cNvPicPr/>
+                        </pic:nvPicPr>
+                        <pic:blipFill>
+                          <a:blip r:embed="rId12"/>
+                          <a:stretch>
+                            <a:fillRect/>
+                          </a:stretch>
+                        </pic:blipFill>
+                        <pic:spPr>
+                          <a:xfrm>
+                            <a:off x="0" y="0"/>
+                            <a:ext cx="640080" cy="640080"/>
+                          </a:xfrm>
+                          <a:prstGeom prst="rect"/>
+                        </pic:spPr>
+                      </pic:pic>
+                    </a:graphicData>
+                  </a:graphic>
+                </wp:inline>
+              </w:drawing>
+            </w:r>
+          </w:p>
+          <w:p>
+            <w:pPr>
+              <w:spacing w:before="0" w:after="0" w:line="240" w:lineRule="auto"/>
+              <w:jc w:val="center"/>
+            </w:pPr>
+            <w:hyperlink r:id="rId13">
+              <w:r>
+                <w:rPr>
+                  <w:rFonts w:ascii="Latin Modern Roman" w:hAnsi="Latin Modern Roman"/>
+                  <w:color w:val="173F31"/>
+                  <w:sz w:val="12"/>
+                  <w:u w:val="single"/>
+                </w:rPr>
+                <w:t>forms.gle/UfX94ByYVjH8Ycmc6</w:t>
+              </w:r>
+            </w:hyperlink>
+          </w:p>
+        </w:tc>
+      </w:tr>
+    </w:tbl>
     <w:sectPr>
       <w:headerReference w:type="default" r:id="rId9"/>
       <w:pgSz w:w="8640" w:h="10800"/>

</xml_diff>